<commit_message>
Humans in Control: finalize application answers, add SMS/email testing/deliverability
Josh confirmed SMS, email A/B testing, and deliverability; added to master profile
and resume. CLAUDE.md: stop over-confirming, deliver finished pasteable text.

Co-Authored-By: Claude Opus 5.5 <noreply@anthropic.com>
Claude-Session: https://claude.ai/code/session_01XE6aV5LP3W9C1iWzBfgedS
</commit_message>
<xml_diff>
--- a/applications/humans-in-control-digital-campaigns-manager/HumansInControl-DigitalCampaignsManager-Resume.docx
+++ b/applications/humans-in-control-digital-campaigns-manager/HumansInControl-DigitalCampaignsManager-Resume.docx
@@ -80,7 +80,7 @@
           <w:i w:val="0"/>
           <w:color w:val="1A1A1A"/>
         </w:rPr>
-        <w:t>Hands-on digital campaigns operator who writes, builds, sends, and reports on email programs and conversion pages every week. Built a 20+ workflow automation system end to end at Solenzo (capture, segmentation, confirmations and reminders, onboarding nurture, reactivation), and writes the copy, landing pages, and newsletters that move busy small business owners to act. Fluent in CRM and email platforms (HubSpot, Salesforce, GoHighLevel, Marketo, Mailchimp), builds web pages directly in HTML/CSS, and works daily in agentic AI tools including Claude Code. Political Science minor who writes plainly for non-expert audiences and verifies before shipping.</w:t>
+        <w:t>Hands-on digital campaigns operator who writes, builds, sends, tests, and reports on email and SMS programs and conversion pages every week. Built a 20+ workflow automation system end to end at Solenzo (capture, segmentation, confirmations and reminders, onboarding nurture, reactivation), and writes the copy, landing pages, and newsletters that move busy small business owners to act. Fluent in CRM and email platforms (HubSpot, Salesforce, GoHighLevel, Marketo, Mailchimp), builds web pages directly in HTML/CSS, and works daily in agentic AI tools including Claude Code. Political Science minor who writes plainly for non-expert audiences and verifies before shipping.</w:t>
       </w:r>
     </w:p>
     <w:p>
@@ -177,7 +177,7 @@
           <w:i w:val="0"/>
           <w:color w:val="1A1A1A"/>
         </w:rPr>
-        <w:t>Built and run a 20+ workflow automation program spanning lead capture, tagging and routing, qualification, booking with automated confirmations and reminders, no-show recovery, onboarding nurture, long-term reactivation, and review-generation asks.</w:t>
+        <w:t>Built and run a 20+ workflow email and SMS automation program spanning lead capture, tagging and routing, qualification, booking with automated text and email confirmations and reminders, no-show recovery, onboarding nurture, long-term reactivation, and review-generation asks.</w:t>
       </w:r>
     </w:p>
     <w:p>
@@ -273,7 +273,7 @@
           <w:i w:val="0"/>
           <w:color w:val="1A1A1A"/>
         </w:rPr>
-        <w:t>Maintain segmentation, lifecycle stages, and strict data-hygiene protocols in GoHighLevel and HubSpot, and report opens, clicks, conversions, and drop-off with recommendations on what to change.</w:t>
+        <w:t>Maintain segmentation, lifecycle stages, list hygiene, and sender authentication (SPF, DKIM, DMARC, domain warmup, bounce handling) in GoHighLevel and HubSpot; A/B test subject lines and content and report opens, clicks, conversions, and drop-off with what to change.</w:t>
       </w:r>
     </w:p>
     <w:p>
@@ -945,7 +945,7 @@
           <w:i w:val="0"/>
           <w:color w:val="1A1A1A"/>
         </w:rPr>
-        <w:t>Email Program Management, Action Alerts &amp; Newsletters, Segmentation &amp; List Hygiene, Automated Journeys, A/B Testing, Open / Click / Conversion Reporting</w:t>
+        <w:t>Email &amp; SMS Programs, Action Alerts &amp; Newsletters, Segmentation &amp; List Hygiene, Deliverability (SPF/DKIM/DMARC), Automated Welcome Journeys, Email A/B Testing, Open / Click / Conversion Reporting</w:t>
       </w:r>
     </w:p>
     <w:p>

</xml_diff>